<commit_message>
feat: Add student password reset feature from admin panel and update Class 7/8 questions
</commit_message>
<xml_diff>
--- a/Questions/Class 7/ch2.docx
+++ b/Questions/Class 7/ch2.docx
@@ -1,6 +1,6 @@
 
 <file path=word/document.xml><?xml version="1.0" encoding="utf-8"?>
-<w:document xmlns:wpc="http://schemas.microsoft.com/office/word/2010/wordprocessingCanvas" xmlns:cx="http://schemas.microsoft.com/office/drawing/2014/chartex" xmlns:cx1="http://schemas.microsoft.com/office/drawing/2015/9/8/chartex" xmlns:cx2="http://schemas.microsoft.com/office/drawing/2015/10/21/chartex" xmlns:cx3="http://schemas.microsoft.com/office/drawing/2016/5/9/chartex" xmlns:cx4="http://schemas.microsoft.com/office/drawing/2016/5/10/chartex" xmlns:cx5="http://schemas.microsoft.com/office/drawing/2016/5/11/chartex" xmlns:cx6="http://schemas.microsoft.com/office/drawing/2016/5/12/chartex" xmlns:cx7="http://schemas.microsoft.com/office/drawing/2016/5/13/chartex" xmlns:cx8="http://schemas.microsoft.com/office/drawing/2016/5/14/chartex" xmlns:mc="http://schemas.openxmlformats.org/markup-compatibility/2006" xmlns:aink="http://schemas.microsoft.com/office/drawing/2016/ink" xmlns:am3d="http://schemas.microsoft.com/office/drawing/2017/model3d" xmlns:o="urn:schemas-microsoft-com:office:office" xmlns:oel="http://schemas.microsoft.com/office/2019/extlst" xmlns:r="http://schemas.openxmlformats.org/officeDocument/2006/relationships" xmlns:m="http://schemas.openxmlformats.org/officeDocument/2006/math" xmlns:v="urn:schemas-microsoft-com:vml" xmlns:wp14="http://schemas.microsoft.com/office/word/2010/wordprocessingDrawing" xmlns:wp="http://schemas.openxmlformats.org/drawingml/2006/wordprocessingDrawing" xmlns:w10="urn:schemas-microsoft-com:office:word" xmlns:w="http://schemas.openxmlformats.org/wordprocessingml/2006/main" xmlns:w14="http://schemas.microsoft.com/office/word/2010/wordml" xmlns:w15="http://schemas.microsoft.com/office/word/2012/wordml" xmlns:w16cex="http://schemas.microsoft.com/office/word/2018/wordml/cex" xmlns:w16cid="http://schemas.microsoft.com/office/word/2016/wordml/cid" xmlns:w16="http://schemas.microsoft.com/office/word/2018/wordml" xmlns:w16du="http://schemas.microsoft.com/office/word/2023/wordml/word16du" xmlns:w16sdtdh="http://schemas.microsoft.com/office/word/2020/wordml/sdtdatahash" xmlns:w16se="http://schemas.microsoft.com/office/word/2015/wordml/symex" xmlns:wpg="http://schemas.microsoft.com/office/word/2010/wordprocessingGroup" xmlns:wpi="http://schemas.microsoft.com/office/word/2010/wordprocessingInk" xmlns:wne="http://schemas.microsoft.com/office/word/2006/wordml" xmlns:wps="http://schemas.microsoft.com/office/word/2010/wordprocessingShape" mc:Ignorable="w14 w15 w16se w16cid w16 w16cex w16sdtdh wp14">
+<w:document xmlns:wpc="http://schemas.microsoft.com/office/word/2010/wordprocessingCanvas" xmlns:cx="http://schemas.microsoft.com/office/drawing/2014/chartex" xmlns:cx1="http://schemas.microsoft.com/office/drawing/2015/9/8/chartex" xmlns:cx2="http://schemas.microsoft.com/office/drawing/2015/10/21/chartex" xmlns:cx3="http://schemas.microsoft.com/office/drawing/2016/5/9/chartex" xmlns:cx4="http://schemas.microsoft.com/office/drawing/2016/5/10/chartex" xmlns:cx5="http://schemas.microsoft.com/office/drawing/2016/5/11/chartex" xmlns:cx6="http://schemas.microsoft.com/office/drawing/2016/5/12/chartex" xmlns:cx7="http://schemas.microsoft.com/office/drawing/2016/5/13/chartex" xmlns:cx8="http://schemas.microsoft.com/office/drawing/2016/5/14/chartex" xmlns:mc="http://schemas.openxmlformats.org/markup-compatibility/2006" xmlns:aink="http://schemas.microsoft.com/office/drawing/2016/ink" xmlns:am3d="http://schemas.microsoft.com/office/drawing/2017/model3d" xmlns:o="urn:schemas-microsoft-com:office:office" xmlns:oel="http://schemas.microsoft.com/office/2019/extlst" xmlns:r="http://schemas.openxmlformats.org/officeDocument/2006/relationships" xmlns:m="http://schemas.openxmlformats.org/officeDocument/2006/math" xmlns:v="urn:schemas-microsoft-com:vml" xmlns:wp14="http://schemas.microsoft.com/office/word/2010/wordprocessingDrawing" xmlns:wp="http://schemas.openxmlformats.org/drawingml/2006/wordprocessingDrawing" xmlns:w10="urn:schemas-microsoft-com:office:word" xmlns:w="http://schemas.openxmlformats.org/wordprocessingml/2006/main" xmlns:w14="http://schemas.microsoft.com/office/word/2010/wordml" xmlns:w15="http://schemas.microsoft.com/office/word/2012/wordml" xmlns:w16cex="http://schemas.microsoft.com/office/word/2018/wordml/cex" xmlns:w16cid="http://schemas.microsoft.com/office/word/2016/wordml/cid" xmlns:w16="http://schemas.microsoft.com/office/word/2018/wordml" xmlns:w16du="http://schemas.microsoft.com/office/word/2023/wordml/word16du" xmlns:w16sdtdh="http://schemas.microsoft.com/office/word/2020/wordml/sdtdatahash" xmlns:w16sdtfl="http://schemas.microsoft.com/office/word/2024/wordml/sdtformatlock" xmlns:w16se="http://schemas.microsoft.com/office/word/2015/wordml/symex" xmlns:wpg="http://schemas.microsoft.com/office/word/2010/wordprocessingGroup" xmlns:wpi="http://schemas.microsoft.com/office/word/2010/wordprocessingInk" xmlns:wne="http://schemas.microsoft.com/office/word/2006/wordml" xmlns:wps="http://schemas.microsoft.com/office/word/2010/wordprocessingShape" mc:Ignorable="w14 w15 w16se w16cid w16 w16cex w16sdtdh w16sdtfl w16du wp14">
   <w:body>
     <w:p>
       <w:pPr>
@@ -15,13 +15,8 @@
         <w:pStyle w:val="NormalWeb"/>
       </w:pPr>
       <w:r>
-        <w:t xml:space="preserve">Type: </w:t>
-      </w:r>
-      <w:proofErr w:type="spellStart"/>
-      <w:r>
-        <w:t>mcq</w:t>
-      </w:r>
-      <w:proofErr w:type="spellEnd"/>
+        <w:t>Type: mcq</w:t>
+      </w:r>
     </w:p>
     <w:p>
       <w:pPr>
@@ -76,13 +71,8 @@
         <w:pStyle w:val="NormalWeb"/>
       </w:pPr>
       <w:r>
-        <w:t xml:space="preserve">Type: </w:t>
-      </w:r>
-      <w:proofErr w:type="spellStart"/>
-      <w:r>
-        <w:t>mcq</w:t>
-      </w:r>
-      <w:proofErr w:type="spellEnd"/>
+        <w:t>Type: mcq</w:t>
+      </w:r>
     </w:p>
     <w:p>
       <w:pPr>
@@ -137,13 +127,8 @@
         <w:pStyle w:val="NormalWeb"/>
       </w:pPr>
       <w:r>
-        <w:t xml:space="preserve">Type: </w:t>
-      </w:r>
-      <w:proofErr w:type="spellStart"/>
-      <w:r>
-        <w:t>mcq</w:t>
-      </w:r>
-      <w:proofErr w:type="spellEnd"/>
+        <w:t>Type: mcq</w:t>
+      </w:r>
     </w:p>
     <w:p>
       <w:pPr>
@@ -198,13 +183,8 @@
         <w:pStyle w:val="NormalWeb"/>
       </w:pPr>
       <w:r>
-        <w:t xml:space="preserve">Type: </w:t>
-      </w:r>
-      <w:proofErr w:type="spellStart"/>
-      <w:r>
-        <w:t>mcq</w:t>
-      </w:r>
-      <w:proofErr w:type="spellEnd"/>
+        <w:t>Type: mcq</w:t>
+      </w:r>
     </w:p>
     <w:p>
       <w:pPr>
@@ -260,13 +240,8 @@
         <w:pStyle w:val="NormalWeb"/>
       </w:pPr>
       <w:r>
-        <w:t xml:space="preserve">Type: </w:t>
-      </w:r>
-      <w:proofErr w:type="spellStart"/>
-      <w:r>
-        <w:t>mcq</w:t>
-      </w:r>
-      <w:proofErr w:type="spellEnd"/>
+        <w:t>Type: mcq</w:t>
+      </w:r>
     </w:p>
     <w:p>
       <w:pPr>
@@ -321,13 +296,8 @@
         <w:pStyle w:val="NormalWeb"/>
       </w:pPr>
       <w:r>
-        <w:t xml:space="preserve">Type: </w:t>
-      </w:r>
-      <w:proofErr w:type="spellStart"/>
-      <w:r>
-        <w:t>mcq</w:t>
-      </w:r>
-      <w:proofErr w:type="spellEnd"/>
+        <w:t>Type: mcq</w:t>
+      </w:r>
     </w:p>
     <w:p>
       <w:pPr>
@@ -382,13 +352,8 @@
         <w:pStyle w:val="NormalWeb"/>
       </w:pPr>
       <w:r>
-        <w:t xml:space="preserve">Type: </w:t>
-      </w:r>
-      <w:proofErr w:type="spellStart"/>
-      <w:r>
-        <w:t>mcq</w:t>
-      </w:r>
-      <w:proofErr w:type="spellEnd"/>
+        <w:t>Type: mcq</w:t>
+      </w:r>
     </w:p>
     <w:p>
       <w:pPr>
@@ -444,13 +409,8 @@
       </w:pPr>
       <w:r>
         <w:lastRenderedPageBreak/>
-        <w:t xml:space="preserve">Type: </w:t>
-      </w:r>
-      <w:proofErr w:type="spellStart"/>
-      <w:r>
-        <w:t>mcq</w:t>
-      </w:r>
-      <w:proofErr w:type="spellEnd"/>
+        <w:t>Type: mcq</w:t>
+      </w:r>
     </w:p>
     <w:p>
       <w:pPr>
@@ -505,13 +465,8 @@
         <w:pStyle w:val="NormalWeb"/>
       </w:pPr>
       <w:r>
-        <w:t xml:space="preserve">Type: </w:t>
-      </w:r>
-      <w:proofErr w:type="spellStart"/>
-      <w:r>
-        <w:t>mcq</w:t>
-      </w:r>
-      <w:proofErr w:type="spellEnd"/>
+        <w:t>Type: mcq</w:t>
+      </w:r>
     </w:p>
     <w:p>
       <w:pPr>
@@ -566,39 +521,24 @@
         <w:pStyle w:val="NormalWeb"/>
       </w:pPr>
       <w:r>
-        <w:t xml:space="preserve">Type: </w:t>
-      </w:r>
-      <w:proofErr w:type="spellStart"/>
-      <w:r>
-        <w:t>mcq</w:t>
-      </w:r>
-      <w:proofErr w:type="spellEnd"/>
-    </w:p>
-    <w:p>
-      <w:pPr>
-        <w:pStyle w:val="NormalWeb"/>
-      </w:pPr>
-      <w:r>
-        <w:t xml:space="preserve">A) The column </w:t>
-      </w:r>
-      <w:proofErr w:type="gramStart"/>
-      <w:r>
-        <w:t>label</w:t>
-      </w:r>
-      <w:proofErr w:type="gramEnd"/>
-    </w:p>
-    <w:p>
-      <w:pPr>
-        <w:pStyle w:val="NormalWeb"/>
-      </w:pPr>
-      <w:r>
-        <w:t xml:space="preserve">B) The row </w:t>
-      </w:r>
-      <w:proofErr w:type="gramStart"/>
-      <w:r>
-        <w:t>number</w:t>
-      </w:r>
-      <w:proofErr w:type="gramEnd"/>
+        <w:t>Type: mcq</w:t>
+      </w:r>
+    </w:p>
+    <w:p>
+      <w:pPr>
+        <w:pStyle w:val="NormalWeb"/>
+      </w:pPr>
+      <w:r>
+        <w:t>A) The column label</w:t>
+      </w:r>
+    </w:p>
+    <w:p>
+      <w:pPr>
+        <w:pStyle w:val="NormalWeb"/>
+      </w:pPr>
+      <w:r>
+        <w:t>B) The row number</w:t>
+      </w:r>
     </w:p>
     <w:p>
       <w:pPr>
@@ -1007,13 +947,8 @@
         <w:pStyle w:val="NormalWeb"/>
       </w:pPr>
       <w:r>
-        <w:t xml:space="preserve">Answer: </w:t>
-      </w:r>
-      <w:proofErr w:type="spellStart"/>
-      <w:r>
-        <w:t>autosum</w:t>
-      </w:r>
-      <w:proofErr w:type="spellEnd"/>
+        <w:t>Answer: autosum</w:t>
+      </w:r>
     </w:p>
     <w:p>
       <w:pPr>
@@ -1140,71 +1075,40 @@
       <w:pPr>
         <w:pStyle w:val="NormalWeb"/>
       </w:pPr>
-      <w:proofErr w:type="gramStart"/>
-      <w:r>
-        <w:t>Relative :</w:t>
-      </w:r>
-      <w:proofErr w:type="gramEnd"/>
-      <w:r>
-        <w:t xml:space="preserve"> D4</w:t>
-      </w:r>
-    </w:p>
-    <w:p>
-      <w:pPr>
-        <w:pStyle w:val="NormalWeb"/>
-      </w:pPr>
-      <w:proofErr w:type="gramStart"/>
-      <w:r>
-        <w:t>Absolute :</w:t>
-      </w:r>
-      <w:proofErr w:type="gramEnd"/>
-      <w:r>
-        <w:t xml:space="preserve"> $D$4 </w:t>
-      </w:r>
-    </w:p>
-    <w:p>
-      <w:pPr>
-        <w:pStyle w:val="NormalWeb"/>
-      </w:pPr>
-      <w:proofErr w:type="gramStart"/>
-      <w:r>
-        <w:t>Mixed :</w:t>
-      </w:r>
-      <w:proofErr w:type="gramEnd"/>
-      <w:r>
-        <w:t xml:space="preserve"> $D4 </w:t>
-      </w:r>
-    </w:p>
-    <w:p>
-      <w:pPr>
-        <w:pStyle w:val="NormalWeb"/>
-      </w:pPr>
-      <w:r>
-        <w:t xml:space="preserve">First </w:t>
-      </w:r>
-      <w:proofErr w:type="gramStart"/>
-      <w:r>
-        <w:t>Cell :</w:t>
-      </w:r>
-      <w:proofErr w:type="gramEnd"/>
-      <w:r>
-        <w:t xml:space="preserve"> A1 </w:t>
-      </w:r>
-    </w:p>
-    <w:p>
-      <w:pPr>
-        <w:pStyle w:val="NormalWeb"/>
-      </w:pPr>
-      <w:r>
-        <w:t xml:space="preserve">Last </w:t>
-      </w:r>
-      <w:proofErr w:type="gramStart"/>
-      <w:r>
-        <w:t>Cell :</w:t>
-      </w:r>
-      <w:proofErr w:type="gramEnd"/>
-      <w:r>
-        <w:t xml:space="preserve"> XFD1048576</w:t>
+      <w:r>
+        <w:t>Relative : D4</w:t>
+      </w:r>
+    </w:p>
+    <w:p>
+      <w:pPr>
+        <w:pStyle w:val="NormalWeb"/>
+      </w:pPr>
+      <w:r>
+        <w:t xml:space="preserve">Absolute : $D$4 </w:t>
+      </w:r>
+    </w:p>
+    <w:p>
+      <w:pPr>
+        <w:pStyle w:val="NormalWeb"/>
+      </w:pPr>
+      <w:r>
+        <w:t xml:space="preserve">Mixed : $D4 </w:t>
+      </w:r>
+    </w:p>
+    <w:p>
+      <w:pPr>
+        <w:pStyle w:val="NormalWeb"/>
+      </w:pPr>
+      <w:r>
+        <w:t xml:space="preserve">First Cell : A1 </w:t>
+      </w:r>
+    </w:p>
+    <w:p>
+      <w:pPr>
+        <w:pStyle w:val="NormalWeb"/>
+      </w:pPr>
+      <w:r>
+        <w:t>Last Cell : XFD1048576</w:t>
       </w:r>
     </w:p>
     <w:p>
@@ -1235,65 +1139,40 @@
       <w:pPr>
         <w:pStyle w:val="NormalWeb"/>
       </w:pPr>
-      <w:proofErr w:type="gramStart"/>
-      <w:r>
-        <w:t>SUM :</w:t>
-      </w:r>
-      <w:proofErr w:type="gramEnd"/>
-      <w:r>
-        <w:t xml:space="preserve"> Addition</w:t>
-      </w:r>
-    </w:p>
-    <w:p>
-      <w:pPr>
-        <w:pStyle w:val="NormalWeb"/>
-      </w:pPr>
-      <w:proofErr w:type="gramStart"/>
-      <w:r>
-        <w:t>PRODUCT :</w:t>
-      </w:r>
-      <w:proofErr w:type="gramEnd"/>
-      <w:r>
-        <w:t xml:space="preserve"> Multiplication</w:t>
-      </w:r>
-    </w:p>
-    <w:p>
-      <w:pPr>
-        <w:pStyle w:val="NormalWeb"/>
-      </w:pPr>
-      <w:proofErr w:type="gramStart"/>
-      <w:r>
-        <w:t>QUOTIENT :</w:t>
-      </w:r>
-      <w:proofErr w:type="gramEnd"/>
-      <w:r>
-        <w:t xml:space="preserve"> Division result</w:t>
-      </w:r>
-    </w:p>
-    <w:p>
-      <w:pPr>
-        <w:pStyle w:val="NormalWeb"/>
-      </w:pPr>
-      <w:proofErr w:type="gramStart"/>
-      <w:r>
-        <w:t>POWER :</w:t>
-      </w:r>
-      <w:proofErr w:type="gramEnd"/>
-      <w:r>
-        <w:t xml:space="preserve"> Exponentiation</w:t>
-      </w:r>
-    </w:p>
-    <w:p>
-      <w:pPr>
-        <w:pStyle w:val="NormalWeb"/>
-      </w:pPr>
-      <w:proofErr w:type="gramStart"/>
-      <w:r>
-        <w:t>COUNT :</w:t>
-      </w:r>
-      <w:proofErr w:type="gramEnd"/>
-      <w:r>
-        <w:t xml:space="preserve"> Count numbers</w:t>
+      <w:r>
+        <w:t>SUM : Addition</w:t>
+      </w:r>
+    </w:p>
+    <w:p>
+      <w:pPr>
+        <w:pStyle w:val="NormalWeb"/>
+      </w:pPr>
+      <w:r>
+        <w:t>PRODUCT : Multiplication</w:t>
+      </w:r>
+    </w:p>
+    <w:p>
+      <w:pPr>
+        <w:pStyle w:val="NormalWeb"/>
+      </w:pPr>
+      <w:r>
+        <w:t>QUOTIENT : Division result</w:t>
+      </w:r>
+    </w:p>
+    <w:p>
+      <w:pPr>
+        <w:pStyle w:val="NormalWeb"/>
+      </w:pPr>
+      <w:r>
+        <w:t>POWER : Exponentiation</w:t>
+      </w:r>
+    </w:p>
+    <w:p>
+      <w:pPr>
+        <w:pStyle w:val="NormalWeb"/>
+      </w:pPr>
+      <w:r>
+        <w:t>COUNT : Count numbers</w:t>
       </w:r>
     </w:p>
     <w:p>
@@ -1324,74 +1203,49 @@
       <w:pPr>
         <w:pStyle w:val="NormalWeb"/>
       </w:pPr>
-      <w:proofErr w:type="gramStart"/>
       <w:r>
         <w:lastRenderedPageBreak/>
-        <w:t>MAX :</w:t>
-      </w:r>
-      <w:proofErr w:type="gramEnd"/>
-      <w:r>
-        <w:t xml:space="preserve"> Find highest</w:t>
-      </w:r>
-    </w:p>
-    <w:p>
-      <w:pPr>
-        <w:pStyle w:val="NormalWeb"/>
-      </w:pPr>
-      <w:proofErr w:type="gramStart"/>
-      <w:r>
-        <w:t>MIN :</w:t>
-      </w:r>
-      <w:proofErr w:type="gramEnd"/>
-      <w:r>
-        <w:t xml:space="preserve"> Find lowest</w:t>
-      </w:r>
-    </w:p>
-    <w:p>
-      <w:pPr>
-        <w:pStyle w:val="NormalWeb"/>
-      </w:pPr>
-      <w:proofErr w:type="gramStart"/>
-      <w:r>
-        <w:t>AVERAGE :</w:t>
-      </w:r>
-      <w:proofErr w:type="gramEnd"/>
-      <w:r>
-        <w:t xml:space="preserve"> Calculate mean</w:t>
-      </w:r>
-    </w:p>
-    <w:p>
-      <w:pPr>
-        <w:pStyle w:val="NormalWeb"/>
-      </w:pPr>
-      <w:proofErr w:type="gramStart"/>
-      <w:r>
-        <w:t>COUNT :</w:t>
-      </w:r>
-      <w:proofErr w:type="gramEnd"/>
-      <w:r>
-        <w:t xml:space="preserve"> Count numeric cells</w:t>
-      </w:r>
-    </w:p>
-    <w:p>
-      <w:pPr>
-        <w:pStyle w:val="NormalWeb"/>
-      </w:pPr>
-      <w:proofErr w:type="gramStart"/>
-      <w:r>
-        <w:t>AutoSum :</w:t>
-      </w:r>
-      <w:proofErr w:type="gramEnd"/>
-      <w:r>
-        <w:t xml:space="preserve"> Shortcut</w:t>
-      </w:r>
-    </w:p>
-    <w:p>
-      <w:pPr>
-        <w:pStyle w:val="NormalWeb"/>
-      </w:pPr>
-      <w:r>
-        <w:t>Question: Match the function category to the specific function.</w:t>
+        <w:t>MAX : Find highest</w:t>
+      </w:r>
+    </w:p>
+    <w:p>
+      <w:pPr>
+        <w:pStyle w:val="NormalWeb"/>
+      </w:pPr>
+      <w:r>
+        <w:t>MIN : Find lowest</w:t>
+      </w:r>
+    </w:p>
+    <w:p>
+      <w:pPr>
+        <w:pStyle w:val="NormalWeb"/>
+      </w:pPr>
+      <w:r>
+        <w:t>AVERAGE : Calculate mean</w:t>
+      </w:r>
+    </w:p>
+    <w:p>
+      <w:pPr>
+        <w:pStyle w:val="NormalWeb"/>
+      </w:pPr>
+      <w:r>
+        <w:t>COUNT : Count numeric cells</w:t>
+      </w:r>
+    </w:p>
+    <w:p>
+      <w:pPr>
+        <w:pStyle w:val="NormalWeb"/>
+      </w:pPr>
+      <w:r>
+        <w:t>AutoSum : Shortcut</w:t>
+      </w:r>
+    </w:p>
+    <w:p>
+      <w:pPr>
+        <w:pStyle w:val="NormalWeb"/>
+      </w:pPr>
+      <w:r>
+        <w:t>Question: Match the input component to its description.</w:t>
       </w:r>
     </w:p>
     <w:p>
@@ -1415,81 +1269,47 @@
         <w:pStyle w:val="NormalWeb"/>
       </w:pPr>
       <w:r>
-        <w:t xml:space="preserve">Math &amp; </w:t>
-      </w:r>
-      <w:proofErr w:type="gramStart"/>
-      <w:r>
-        <w:t>Trig :</w:t>
-      </w:r>
-      <w:proofErr w:type="gramEnd"/>
-      <w:r>
-        <w:t xml:space="preserve"> SUM</w:t>
-      </w:r>
-    </w:p>
-    <w:p>
-      <w:pPr>
-        <w:pStyle w:val="NormalWeb"/>
-      </w:pPr>
-      <w:proofErr w:type="gramStart"/>
-      <w:r>
-        <w:t>Statistical :</w:t>
-      </w:r>
-      <w:proofErr w:type="gramEnd"/>
-      <w:r>
-        <w:t xml:space="preserve"> MAX</w:t>
-      </w:r>
-    </w:p>
-    <w:p>
-      <w:pPr>
-        <w:pStyle w:val="NormalWeb"/>
-      </w:pPr>
-      <w:r>
-        <w:t xml:space="preserve">Math &amp; </w:t>
-      </w:r>
-      <w:proofErr w:type="gramStart"/>
-      <w:r>
-        <w:t>Trig :</w:t>
-      </w:r>
-      <w:proofErr w:type="gramEnd"/>
-      <w:r>
-        <w:t xml:space="preserve"> PRODUCT</w:t>
-      </w:r>
-    </w:p>
-    <w:p>
-      <w:pPr>
-        <w:pStyle w:val="NormalWeb"/>
-      </w:pPr>
-      <w:proofErr w:type="gramStart"/>
-      <w:r>
-        <w:t>Statistical :</w:t>
-      </w:r>
-      <w:proofErr w:type="gramEnd"/>
-      <w:r>
-        <w:t xml:space="preserve"> MIN</w:t>
-      </w:r>
-    </w:p>
-    <w:p>
-      <w:pPr>
-        <w:pStyle w:val="NormalWeb"/>
-      </w:pPr>
-      <w:r>
-        <w:t xml:space="preserve">Math &amp; </w:t>
-      </w:r>
-      <w:proofErr w:type="gramStart"/>
-      <w:r>
-        <w:t>Trig :</w:t>
-      </w:r>
-      <w:proofErr w:type="gramEnd"/>
-      <w:r>
-        <w:t xml:space="preserve"> POWER</w:t>
-      </w:r>
-    </w:p>
-    <w:p>
-      <w:pPr>
-        <w:pStyle w:val="NormalWeb"/>
-      </w:pPr>
-      <w:r>
-        <w:t>Question: Match the input component to its description.</w:t>
+        <w:t>$ : Absolute sign</w:t>
+      </w:r>
+    </w:p>
+    <w:p>
+      <w:pPr>
+        <w:pStyle w:val="NormalWeb"/>
+      </w:pPr>
+      <w:r>
+        <w:t>: : Range separator</w:t>
+      </w:r>
+    </w:p>
+    <w:p>
+      <w:pPr>
+        <w:pStyle w:val="NormalWeb"/>
+      </w:pPr>
+      <w:r>
+        <w:t>= : Formula start</w:t>
+      </w:r>
+    </w:p>
+    <w:p>
+      <w:pPr>
+        <w:pStyle w:val="NormalWeb"/>
+      </w:pPr>
+      <w:r>
+        <w:t>( ) : Argument brackets</w:t>
+      </w:r>
+    </w:p>
+    <w:p>
+      <w:pPr>
+        <w:pStyle w:val="NormalWeb"/>
+      </w:pPr>
+      <w:r>
+        <w:t>Alphanumeric : Cell address</w:t>
+      </w:r>
+    </w:p>
+    <w:p>
+      <w:pPr>
+        <w:pStyle w:val="NormalWeb"/>
+      </w:pPr>
+      <w:r>
+        <w:t>Question: Match the mathematical function inputs to their names.</w:t>
       </w:r>
     </w:p>
     <w:p>
@@ -1512,73 +1332,48 @@
       <w:pPr>
         <w:pStyle w:val="NormalWeb"/>
       </w:pPr>
-      <w:proofErr w:type="gramStart"/>
-      <w:r>
-        <w:t>$ :</w:t>
-      </w:r>
-      <w:proofErr w:type="gramEnd"/>
-      <w:r>
-        <w:t xml:space="preserve"> Absolute sign</w:t>
-      </w:r>
-    </w:p>
-    <w:p>
-      <w:pPr>
-        <w:pStyle w:val="NormalWeb"/>
-      </w:pPr>
-      <w:proofErr w:type="gramStart"/>
-      <w:r>
-        <w:t>: :</w:t>
-      </w:r>
-      <w:proofErr w:type="gramEnd"/>
-      <w:r>
-        <w:t xml:space="preserve"> Range separator</w:t>
-      </w:r>
-    </w:p>
-    <w:p>
-      <w:pPr>
-        <w:pStyle w:val="NormalWeb"/>
-      </w:pPr>
-      <w:proofErr w:type="gramStart"/>
-      <w:r>
-        <w:t>= :</w:t>
-      </w:r>
-      <w:proofErr w:type="gramEnd"/>
-      <w:r>
-        <w:t xml:space="preserve"> Formula start</w:t>
-      </w:r>
-    </w:p>
-    <w:p>
-      <w:pPr>
-        <w:pStyle w:val="NormalWeb"/>
-      </w:pPr>
-      <w:proofErr w:type="gramStart"/>
-      <w:r>
-        <w:t>( )</w:t>
-      </w:r>
-      <w:proofErr w:type="gramEnd"/>
-      <w:r>
-        <w:t xml:space="preserve"> : Argument brackets</w:t>
-      </w:r>
-    </w:p>
-    <w:p>
-      <w:pPr>
-        <w:pStyle w:val="NormalWeb"/>
-      </w:pPr>
-      <w:proofErr w:type="gramStart"/>
-      <w:r>
-        <w:t>Alphanumeric :</w:t>
-      </w:r>
-      <w:proofErr w:type="gramEnd"/>
-      <w:r>
-        <w:t xml:space="preserve"> Cell address</w:t>
-      </w:r>
-    </w:p>
-    <w:p>
-      <w:pPr>
-        <w:pStyle w:val="NormalWeb"/>
-      </w:pPr>
-      <w:r>
-        <w:t>Question: Match the mathematical function inputs to their names.</w:t>
+      <w:r>
+        <w:t>Number : Power function base</w:t>
+      </w:r>
+    </w:p>
+    <w:p>
+      <w:pPr>
+        <w:pStyle w:val="NormalWeb"/>
+      </w:pPr>
+      <w:r>
+        <w:t>Numerator : Quotient top</w:t>
+      </w:r>
+    </w:p>
+    <w:p>
+      <w:pPr>
+        <w:pStyle w:val="NormalWeb"/>
+      </w:pPr>
+      <w:r>
+        <w:t xml:space="preserve">Denominator : Quotient bottom </w:t>
+      </w:r>
+    </w:p>
+    <w:p>
+      <w:pPr>
+        <w:pStyle w:val="NormalWeb"/>
+      </w:pPr>
+      <w:r>
+        <w:t xml:space="preserve">Power : Exponent value </w:t>
+      </w:r>
+    </w:p>
+    <w:p>
+      <w:pPr>
+        <w:pStyle w:val="NormalWeb"/>
+      </w:pPr>
+      <w:r>
+        <w:t>Range : Multiple cells</w:t>
+      </w:r>
+    </w:p>
+    <w:p>
+      <w:pPr>
+        <w:pStyle w:val="NormalWeb"/>
+      </w:pPr>
+      <w:r>
+        <w:t>Question: Match the Excel error/limit to its meaning.</w:t>
       </w:r>
     </w:p>
     <w:p>
@@ -1601,74 +1396,49 @@
       <w:pPr>
         <w:pStyle w:val="NormalWeb"/>
       </w:pPr>
-      <w:proofErr w:type="gramStart"/>
-      <w:r>
-        <w:t>Number :</w:t>
-      </w:r>
-      <w:proofErr w:type="gramEnd"/>
-      <w:r>
-        <w:t xml:space="preserve"> Power function base</w:t>
-      </w:r>
-    </w:p>
-    <w:p>
-      <w:pPr>
-        <w:pStyle w:val="NormalWeb"/>
-      </w:pPr>
-      <w:proofErr w:type="gramStart"/>
+      <w:r>
+        <w:t>#DIV/0! : Division by zero</w:t>
+      </w:r>
+    </w:p>
+    <w:p>
+      <w:pPr>
+        <w:pStyle w:val="NormalWeb"/>
+      </w:pPr>
       <w:r>
         <w:lastRenderedPageBreak/>
-        <w:t>Numerator :</w:t>
-      </w:r>
-      <w:proofErr w:type="gramEnd"/>
-      <w:r>
-        <w:t xml:space="preserve"> Quotient top</w:t>
-      </w:r>
-    </w:p>
-    <w:p>
-      <w:pPr>
-        <w:pStyle w:val="NormalWeb"/>
-      </w:pPr>
-      <w:proofErr w:type="gramStart"/>
-      <w:r>
-        <w:t>Denominator :</w:t>
-      </w:r>
-      <w:proofErr w:type="gramEnd"/>
-      <w:r>
-        <w:t xml:space="preserve"> Quotient bottom </w:t>
-      </w:r>
-    </w:p>
-    <w:p>
-      <w:pPr>
-        <w:pStyle w:val="NormalWeb"/>
-      </w:pPr>
-      <w:proofErr w:type="gramStart"/>
-      <w:r>
-        <w:t>Power :</w:t>
-      </w:r>
-      <w:proofErr w:type="gramEnd"/>
-      <w:r>
-        <w:t xml:space="preserve"> Exponent value </w:t>
-      </w:r>
-    </w:p>
-    <w:p>
-      <w:pPr>
-        <w:pStyle w:val="NormalWeb"/>
-      </w:pPr>
-      <w:proofErr w:type="gramStart"/>
-      <w:r>
-        <w:t>Range :</w:t>
-      </w:r>
-      <w:proofErr w:type="gramEnd"/>
-      <w:r>
-        <w:t xml:space="preserve"> Multiple cells</w:t>
-      </w:r>
-    </w:p>
-    <w:p>
-      <w:pPr>
-        <w:pStyle w:val="NormalWeb"/>
-      </w:pPr>
-      <w:r>
-        <w:t>Question: Match the Excel error/limit to its meaning.</w:t>
+        <w:t>1048576 : Max rows</w:t>
+      </w:r>
+    </w:p>
+    <w:p>
+      <w:pPr>
+        <w:pStyle w:val="NormalWeb"/>
+      </w:pPr>
+      <w:r>
+        <w:t>XFD : Max column label</w:t>
+      </w:r>
+    </w:p>
+    <w:p>
+      <w:pPr>
+        <w:pStyle w:val="NormalWeb"/>
+      </w:pPr>
+      <w:r>
+        <w:t>Al : Starting cell</w:t>
+      </w:r>
+    </w:p>
+    <w:p>
+      <w:pPr>
+        <w:pStyle w:val="NormalWeb"/>
+      </w:pPr>
+      <w:r>
+        <w:t># : Text in number field</w:t>
+      </w:r>
+    </w:p>
+    <w:p>
+      <w:pPr>
+        <w:pStyle w:val="NormalWeb"/>
+      </w:pPr>
+      <w:r>
+        <w:t>Question: Match the cell parts to their labels.</w:t>
       </w:r>
     </w:p>
     <w:p>
@@ -1692,75 +1462,47 @@
         <w:pStyle w:val="NormalWeb"/>
       </w:pPr>
       <w:r>
-        <w:t>#DIV/0</w:t>
-      </w:r>
-      <w:proofErr w:type="gramStart"/>
-      <w:r>
-        <w:t>! :</w:t>
-      </w:r>
-      <w:proofErr w:type="gramEnd"/>
-      <w:r>
-        <w:t xml:space="preserve"> Division by zero</w:t>
-      </w:r>
-    </w:p>
-    <w:p>
-      <w:pPr>
-        <w:pStyle w:val="NormalWeb"/>
-      </w:pPr>
-      <w:proofErr w:type="gramStart"/>
-      <w:r>
-        <w:t>1048576 :</w:t>
-      </w:r>
-      <w:proofErr w:type="gramEnd"/>
-      <w:r>
-        <w:t xml:space="preserve"> Max rows</w:t>
-      </w:r>
-    </w:p>
-    <w:p>
-      <w:pPr>
-        <w:pStyle w:val="NormalWeb"/>
-      </w:pPr>
-      <w:proofErr w:type="gramStart"/>
-      <w:r>
-        <w:t>XFD :</w:t>
-      </w:r>
-      <w:proofErr w:type="gramEnd"/>
-      <w:r>
-        <w:t xml:space="preserve"> Max column label</w:t>
-      </w:r>
-    </w:p>
-    <w:p>
-      <w:pPr>
-        <w:pStyle w:val="NormalWeb"/>
-      </w:pPr>
-      <w:proofErr w:type="gramStart"/>
-      <w:r>
-        <w:t>Al :</w:t>
-      </w:r>
-      <w:proofErr w:type="gramEnd"/>
-      <w:r>
-        <w:t xml:space="preserve"> Starting cell</w:t>
-      </w:r>
-    </w:p>
-    <w:p>
-      <w:pPr>
-        <w:pStyle w:val="NormalWeb"/>
-      </w:pPr>
-      <w:proofErr w:type="gramStart"/>
-      <w:r>
-        <w:t># :</w:t>
-      </w:r>
-      <w:proofErr w:type="gramEnd"/>
-      <w:r>
-        <w:t xml:space="preserve"> Text in number field</w:t>
-      </w:r>
-    </w:p>
-    <w:p>
-      <w:pPr>
-        <w:pStyle w:val="NormalWeb"/>
-      </w:pPr>
-      <w:r>
-        <w:t>Question: Match the formula method to the tool used.</w:t>
+        <w:t xml:space="preserve">Row : Number </w:t>
+      </w:r>
+    </w:p>
+    <w:p>
+      <w:pPr>
+        <w:pStyle w:val="NormalWeb"/>
+      </w:pPr>
+      <w:r>
+        <w:t>Column : Letter</w:t>
+      </w:r>
+    </w:p>
+    <w:p>
+      <w:pPr>
+        <w:pStyle w:val="NormalWeb"/>
+      </w:pPr>
+      <w:r>
+        <w:t>Intersection : Cell</w:t>
+      </w:r>
+    </w:p>
+    <w:p>
+      <w:pPr>
+        <w:pStyle w:val="NormalWeb"/>
+      </w:pPr>
+      <w:r>
+        <w:t>$D : Absolute column</w:t>
+      </w:r>
+    </w:p>
+    <w:p>
+      <w:pPr>
+        <w:pStyle w:val="NormalWeb"/>
+      </w:pPr>
+      <w:r>
+        <w:t>D$ : Absolute row</w:t>
+      </w:r>
+    </w:p>
+    <w:p>
+      <w:pPr>
+        <w:pStyle w:val="NormalWeb"/>
+      </w:pPr>
+      <w:r>
+        <w:t>Question: Match the example input to the output result.</w:t>
       </w:r>
     </w:p>
     <w:p>
@@ -1784,213 +1526,6 @@
         <w:pStyle w:val="NormalWeb"/>
       </w:pPr>
       <w:r>
-        <w:t xml:space="preserve">Method </w:t>
-      </w:r>
-      <w:proofErr w:type="gramStart"/>
-      <w:r>
-        <w:t>1 :</w:t>
-      </w:r>
-      <w:proofErr w:type="gramEnd"/>
-      <w:r>
-        <w:t xml:space="preserve"> Mouse and Keyboard</w:t>
-      </w:r>
-    </w:p>
-    <w:p>
-      <w:pPr>
-        <w:pStyle w:val="NormalWeb"/>
-      </w:pPr>
-      <w:r>
-        <w:t xml:space="preserve">Method </w:t>
-      </w:r>
-      <w:proofErr w:type="gramStart"/>
-      <w:r>
-        <w:t>2 :</w:t>
-      </w:r>
-      <w:proofErr w:type="gramEnd"/>
-      <w:r>
-        <w:t xml:space="preserve"> Keyboard only</w:t>
-      </w:r>
-    </w:p>
-    <w:p>
-      <w:pPr>
-        <w:pStyle w:val="NormalWeb"/>
-      </w:pPr>
-      <w:proofErr w:type="spellStart"/>
-      <w:r>
-        <w:t>Ctrl+</w:t>
-      </w:r>
-      <w:proofErr w:type="gramStart"/>
-      <w:r>
-        <w:t>C</w:t>
-      </w:r>
-      <w:proofErr w:type="spellEnd"/>
-      <w:r>
-        <w:t xml:space="preserve"> :</w:t>
-      </w:r>
-      <w:proofErr w:type="gramEnd"/>
-      <w:r>
-        <w:t xml:space="preserve"> Copy</w:t>
-      </w:r>
-    </w:p>
-    <w:p>
-      <w:pPr>
-        <w:pStyle w:val="NormalWeb"/>
-      </w:pPr>
-      <w:proofErr w:type="spellStart"/>
-      <w:r>
-        <w:t>Ctrl+</w:t>
-      </w:r>
-      <w:proofErr w:type="gramStart"/>
-      <w:r>
-        <w:t>V</w:t>
-      </w:r>
-      <w:proofErr w:type="spellEnd"/>
-      <w:r>
-        <w:t xml:space="preserve"> :</w:t>
-      </w:r>
-      <w:proofErr w:type="gramEnd"/>
-      <w:r>
-        <w:t xml:space="preserve"> Paste</w:t>
-      </w:r>
-    </w:p>
-    <w:p>
-      <w:pPr>
-        <w:pStyle w:val="NormalWeb"/>
-      </w:pPr>
-      <w:proofErr w:type="gramStart"/>
-      <w:r>
-        <w:t>AutoSum :</w:t>
-      </w:r>
-      <w:proofErr w:type="gramEnd"/>
-      <w:r>
-        <w:t xml:space="preserve"> Formulas tab</w:t>
-      </w:r>
-    </w:p>
-    <w:p>
-      <w:pPr>
-        <w:pStyle w:val="NormalWeb"/>
-      </w:pPr>
-      <w:r>
-        <w:t>Question: Match the cell parts to their labels.</w:t>
-      </w:r>
-    </w:p>
-    <w:p>
-      <w:pPr>
-        <w:pStyle w:val="NormalWeb"/>
-      </w:pPr>
-      <w:r>
-        <w:t>Type: match</w:t>
-      </w:r>
-    </w:p>
-    <w:p>
-      <w:pPr>
-        <w:pStyle w:val="NormalWeb"/>
-      </w:pPr>
-      <w:r>
-        <w:t xml:space="preserve">Answer: </w:t>
-      </w:r>
-    </w:p>
-    <w:p>
-      <w:pPr>
-        <w:pStyle w:val="NormalWeb"/>
-      </w:pPr>
-      <w:proofErr w:type="gramStart"/>
-      <w:r>
-        <w:t>Row :</w:t>
-      </w:r>
-      <w:proofErr w:type="gramEnd"/>
-      <w:r>
-        <w:t xml:space="preserve"> Number </w:t>
-      </w:r>
-    </w:p>
-    <w:p>
-      <w:pPr>
-        <w:pStyle w:val="NormalWeb"/>
-      </w:pPr>
-      <w:proofErr w:type="gramStart"/>
-      <w:r>
-        <w:t>Column :</w:t>
-      </w:r>
-      <w:proofErr w:type="gramEnd"/>
-      <w:r>
-        <w:t xml:space="preserve"> Letter</w:t>
-      </w:r>
-    </w:p>
-    <w:p>
-      <w:pPr>
-        <w:pStyle w:val="NormalWeb"/>
-      </w:pPr>
-      <w:proofErr w:type="gramStart"/>
-      <w:r>
-        <w:lastRenderedPageBreak/>
-        <w:t>Intersection :</w:t>
-      </w:r>
-      <w:proofErr w:type="gramEnd"/>
-      <w:r>
-        <w:t xml:space="preserve"> Cell</w:t>
-      </w:r>
-    </w:p>
-    <w:p>
-      <w:pPr>
-        <w:pStyle w:val="NormalWeb"/>
-      </w:pPr>
-      <w:r>
-        <w:t>$</w:t>
-      </w:r>
-      <w:proofErr w:type="gramStart"/>
-      <w:r>
-        <w:t>D :</w:t>
-      </w:r>
-      <w:proofErr w:type="gramEnd"/>
-      <w:r>
-        <w:t xml:space="preserve"> Absolute column</w:t>
-      </w:r>
-    </w:p>
-    <w:p>
-      <w:pPr>
-        <w:pStyle w:val="NormalWeb"/>
-      </w:pPr>
-      <w:r>
-        <w:t>D</w:t>
-      </w:r>
-      <w:proofErr w:type="gramStart"/>
-      <w:r>
-        <w:t>$ :</w:t>
-      </w:r>
-      <w:proofErr w:type="gramEnd"/>
-      <w:r>
-        <w:t xml:space="preserve"> Absolute row</w:t>
-      </w:r>
-    </w:p>
-    <w:p>
-      <w:pPr>
-        <w:pStyle w:val="NormalWeb"/>
-      </w:pPr>
-      <w:r>
-        <w:t>Question: Match the example input to the output result.</w:t>
-      </w:r>
-    </w:p>
-    <w:p>
-      <w:pPr>
-        <w:pStyle w:val="NormalWeb"/>
-      </w:pPr>
-      <w:r>
-        <w:t>Type: match</w:t>
-      </w:r>
-    </w:p>
-    <w:p>
-      <w:pPr>
-        <w:pStyle w:val="NormalWeb"/>
-      </w:pPr>
-      <w:r>
-        <w:t xml:space="preserve">Answer: </w:t>
-      </w:r>
-    </w:p>
-    <w:p>
-      <w:pPr>
-        <w:pStyle w:val="NormalWeb"/>
-      </w:pPr>
-      <w:r>
         <w:t>SUM(8,16,5) : 29</w:t>
       </w:r>
     </w:p>
@@ -1998,52 +1533,32 @@
       <w:pPr>
         <w:pStyle w:val="NormalWeb"/>
       </w:pPr>
-      <w:proofErr w:type="gramStart"/>
-      <w:r>
-        <w:t>QUOTIENT(</w:t>
-      </w:r>
-      <w:proofErr w:type="gramEnd"/>
-      <w:r>
-        <w:t>35,8) : 4</w:t>
-      </w:r>
-    </w:p>
-    <w:p>
-      <w:pPr>
-        <w:pStyle w:val="NormalWeb"/>
-      </w:pPr>
-      <w:proofErr w:type="gramStart"/>
-      <w:r>
-        <w:t>POWER(</w:t>
-      </w:r>
-      <w:proofErr w:type="gramEnd"/>
-      <w:r>
-        <w:t>3,2) : 9</w:t>
-      </w:r>
-    </w:p>
-    <w:p>
-      <w:pPr>
-        <w:pStyle w:val="NormalWeb"/>
-      </w:pPr>
-      <w:proofErr w:type="gramStart"/>
-      <w:r>
-        <w:t>PRODUCT(</w:t>
-      </w:r>
-      <w:proofErr w:type="gramEnd"/>
-      <w:r>
-        <w:t xml:space="preserve">4,6,3) : 72 </w:t>
-      </w:r>
-    </w:p>
-    <w:p>
-      <w:pPr>
-        <w:pStyle w:val="NormalWeb"/>
-      </w:pPr>
-      <w:proofErr w:type="gramStart"/>
-      <w:r>
-        <w:t>MIN(</w:t>
-      </w:r>
-      <w:proofErr w:type="gramEnd"/>
-      <w:r>
-        <w:t>36,24,-39) : -39</w:t>
+      <w:r>
+        <w:t>QUOTIENT(35,8) : 4</w:t>
+      </w:r>
+    </w:p>
+    <w:p>
+      <w:pPr>
+        <w:pStyle w:val="NormalWeb"/>
+      </w:pPr>
+      <w:r>
+        <w:t>POWER(3,2) : 9</w:t>
+      </w:r>
+    </w:p>
+    <w:p>
+      <w:pPr>
+        <w:pStyle w:val="NormalWeb"/>
+      </w:pPr>
+      <w:r>
+        <w:t xml:space="preserve">PRODUCT(4,6,3) : 72 </w:t>
+      </w:r>
+    </w:p>
+    <w:p>
+      <w:pPr>
+        <w:pStyle w:val="NormalWeb"/>
+      </w:pPr>
+      <w:r>
+        <w:t>MIN(36,24,-39) : -39</w:t>
       </w:r>
     </w:p>
     <w:p>
@@ -2059,13 +1574,8 @@
         <w:pStyle w:val="NormalWeb"/>
       </w:pPr>
       <w:r>
-        <w:t xml:space="preserve">Type: </w:t>
-      </w:r>
-      <w:proofErr w:type="spellStart"/>
-      <w:r>
-        <w:t>truefalse</w:t>
-      </w:r>
-      <w:proofErr w:type="spellEnd"/>
+        <w:t>Type: truefalse</w:t>
+      </w:r>
     </w:p>
     <w:p>
       <w:pPr>
@@ -2088,100 +1598,8 @@
         <w:pStyle w:val="NormalWeb"/>
       </w:pPr>
       <w:r>
-        <w:t xml:space="preserve">Type: </w:t>
-      </w:r>
-      <w:proofErr w:type="spellStart"/>
-      <w:r>
-        <w:t>truefalse</w:t>
-      </w:r>
-      <w:proofErr w:type="spellEnd"/>
-    </w:p>
-    <w:p>
-      <w:pPr>
-        <w:pStyle w:val="NormalWeb"/>
-      </w:pPr>
-      <w:r>
-        <w:t>Answer: true</w:t>
-      </w:r>
-    </w:p>
-    <w:p>
-      <w:pPr>
-        <w:pStyle w:val="NormalWeb"/>
-      </w:pPr>
-      <w:r>
-        <w:t>Question: Functions are predefined formulas already available in Excel.</w:t>
-      </w:r>
-    </w:p>
-    <w:p>
-      <w:pPr>
-        <w:pStyle w:val="NormalWeb"/>
-      </w:pPr>
-      <w:r>
-        <w:t xml:space="preserve">Type: </w:t>
-      </w:r>
-      <w:proofErr w:type="spellStart"/>
-      <w:r>
-        <w:t>truefalse</w:t>
-      </w:r>
-      <w:proofErr w:type="spellEnd"/>
-    </w:p>
-    <w:p>
-      <w:pPr>
-        <w:pStyle w:val="NormalWeb"/>
-      </w:pPr>
-      <w:r>
-        <w:t>Answer: true</w:t>
-      </w:r>
-    </w:p>
-    <w:p>
-      <w:pPr>
-        <w:pStyle w:val="NormalWeb"/>
-      </w:pPr>
-      <w:r>
-        <w:t>Question: The COUNT function counts cells that contain both text and numbers.</w:t>
-      </w:r>
-    </w:p>
-    <w:p>
-      <w:pPr>
-        <w:pStyle w:val="NormalWeb"/>
-      </w:pPr>
-      <w:r>
-        <w:t xml:space="preserve">Type: </w:t>
-      </w:r>
-      <w:proofErr w:type="spellStart"/>
-      <w:r>
-        <w:t>truefalse</w:t>
-      </w:r>
-      <w:proofErr w:type="spellEnd"/>
-    </w:p>
-    <w:p>
-      <w:pPr>
-        <w:pStyle w:val="NormalWeb"/>
-      </w:pPr>
-      <w:r>
-        <w:t>Answer: false</w:t>
-      </w:r>
-    </w:p>
-    <w:p>
-      <w:pPr>
-        <w:pStyle w:val="NormalWeb"/>
-      </w:pPr>
-      <w:r>
-        <w:t>Question: Mixed cell referencing uses both relative and absolute addresses.</w:t>
-      </w:r>
-    </w:p>
-    <w:p>
-      <w:pPr>
-        <w:pStyle w:val="NormalWeb"/>
-      </w:pPr>
-      <w:r>
-        <w:t xml:space="preserve">Type: </w:t>
-      </w:r>
-      <w:proofErr w:type="spellStart"/>
-      <w:r>
-        <w:t>truefalse</w:t>
-      </w:r>
-      <w:proofErr w:type="spellEnd"/>
+        <w:t>Type: truefalse</w:t>
+      </w:r>
     </w:p>
     <w:p>
       <w:pPr>
@@ -2197,6 +1615,78 @@
         <w:pStyle w:val="NormalWeb"/>
       </w:pPr>
       <w:r>
+        <w:t>Question: Functions are predefined formulas already available in Excel.</w:t>
+      </w:r>
+    </w:p>
+    <w:p>
+      <w:pPr>
+        <w:pStyle w:val="NormalWeb"/>
+      </w:pPr>
+      <w:r>
+        <w:t>Type: truefalse</w:t>
+      </w:r>
+    </w:p>
+    <w:p>
+      <w:pPr>
+        <w:pStyle w:val="NormalWeb"/>
+      </w:pPr>
+      <w:r>
+        <w:t>Answer: true</w:t>
+      </w:r>
+    </w:p>
+    <w:p>
+      <w:pPr>
+        <w:pStyle w:val="NormalWeb"/>
+      </w:pPr>
+      <w:r>
+        <w:t>Question: The COUNT function counts cells that contain both text and numbers.</w:t>
+      </w:r>
+    </w:p>
+    <w:p>
+      <w:pPr>
+        <w:pStyle w:val="NormalWeb"/>
+      </w:pPr>
+      <w:r>
+        <w:t>Type: truefalse</w:t>
+      </w:r>
+    </w:p>
+    <w:p>
+      <w:pPr>
+        <w:pStyle w:val="NormalWeb"/>
+      </w:pPr>
+      <w:r>
+        <w:t>Answer: false</w:t>
+      </w:r>
+    </w:p>
+    <w:p>
+      <w:pPr>
+        <w:pStyle w:val="NormalWeb"/>
+      </w:pPr>
+      <w:r>
+        <w:t>Question: Mixed cell referencing uses both relative and absolute addresses.</w:t>
+      </w:r>
+    </w:p>
+    <w:p>
+      <w:pPr>
+        <w:pStyle w:val="NormalWeb"/>
+      </w:pPr>
+      <w:r>
+        <w:t>Type: truefalse</w:t>
+      </w:r>
+    </w:p>
+    <w:p>
+      <w:pPr>
+        <w:pStyle w:val="NormalWeb"/>
+      </w:pPr>
+      <w:r>
+        <w:t>Answer: true</w:t>
+      </w:r>
+    </w:p>
+    <w:p>
+      <w:pPr>
+        <w:pStyle w:val="NormalWeb"/>
+      </w:pPr>
+      <w:r>
         <w:t>Question: The AutoSum button is used for the shortcut insertion of functions.</w:t>
       </w:r>
     </w:p>
@@ -2205,13 +1695,8 @@
         <w:pStyle w:val="NormalWeb"/>
       </w:pPr>
       <w:r>
-        <w:t xml:space="preserve">Type: </w:t>
-      </w:r>
-      <w:proofErr w:type="spellStart"/>
-      <w:r>
-        <w:t>truefalse</w:t>
-      </w:r>
-      <w:proofErr w:type="spellEnd"/>
+        <w:t>Type: truefalse</w:t>
+      </w:r>
     </w:p>
     <w:p>
       <w:pPr>
@@ -2234,13 +1719,8 @@
         <w:pStyle w:val="NormalWeb"/>
       </w:pPr>
       <w:r>
-        <w:t xml:space="preserve">Type: </w:t>
-      </w:r>
-      <w:proofErr w:type="spellStart"/>
-      <w:r>
-        <w:t>truefalse</w:t>
-      </w:r>
-      <w:proofErr w:type="spellEnd"/>
+        <w:t>Type: truefalse</w:t>
+      </w:r>
     </w:p>
     <w:p>
       <w:pPr>
@@ -2263,13 +1743,8 @@
         <w:pStyle w:val="NormalWeb"/>
       </w:pPr>
       <w:r>
-        <w:t xml:space="preserve">Type: </w:t>
-      </w:r>
-      <w:proofErr w:type="spellStart"/>
-      <w:r>
-        <w:t>truefalse</w:t>
-      </w:r>
-      <w:proofErr w:type="spellEnd"/>
+        <w:t>Type: truefalse</w:t>
+      </w:r>
     </w:p>
     <w:p>
       <w:pPr>
@@ -2284,29 +1759,16 @@
         <w:pStyle w:val="NormalWeb"/>
       </w:pPr>
       <w:r>
-        <w:t xml:space="preserve">Question: </w:t>
-      </w:r>
-      <w:proofErr w:type="gramStart"/>
-      <w:r>
-        <w:t>Every</w:t>
-      </w:r>
-      <w:proofErr w:type="gramEnd"/>
-      <w:r>
-        <w:t xml:space="preserve"> function's arguments are written inside round brackets.</w:t>
-      </w:r>
-    </w:p>
-    <w:p>
-      <w:pPr>
-        <w:pStyle w:val="NormalWeb"/>
-      </w:pPr>
-      <w:r>
-        <w:t xml:space="preserve">Type: </w:t>
-      </w:r>
-      <w:proofErr w:type="spellStart"/>
-      <w:r>
-        <w:t>truefalse</w:t>
-      </w:r>
-      <w:proofErr w:type="spellEnd"/>
+        <w:t>Question: Every function's arguments are written inside round brackets.</w:t>
+      </w:r>
+    </w:p>
+    <w:p>
+      <w:pPr>
+        <w:pStyle w:val="NormalWeb"/>
+      </w:pPr>
+      <w:r>
+        <w:t>Type: truefalse</w:t>
+      </w:r>
     </w:p>
     <w:p>
       <w:pPr>
@@ -2329,13 +1791,8 @@
         <w:pStyle w:val="NormalWeb"/>
       </w:pPr>
       <w:r>
-        <w:t xml:space="preserve">Type: </w:t>
-      </w:r>
-      <w:proofErr w:type="spellStart"/>
-      <w:r>
-        <w:t>truefalse</w:t>
-      </w:r>
-      <w:proofErr w:type="spellEnd"/>
+        <w:t>Type: truefalse</w:t>
+      </w:r>
     </w:p>
     <w:p>
       <w:pPr>
@@ -2357,7 +1814,7 @@
 </file>
 
 <file path=word/styles.xml><?xml version="1.0" encoding="utf-8"?>
-<w:styles xmlns:mc="http://schemas.openxmlformats.org/markup-compatibility/2006" xmlns:r="http://schemas.openxmlformats.org/officeDocument/2006/relationships" xmlns:w="http://schemas.openxmlformats.org/wordprocessingml/2006/main" xmlns:w14="http://schemas.microsoft.com/office/word/2010/wordml" xmlns:w15="http://schemas.microsoft.com/office/word/2012/wordml" xmlns:w16cex="http://schemas.microsoft.com/office/word/2018/wordml/cex" xmlns:w16cid="http://schemas.microsoft.com/office/word/2016/wordml/cid" xmlns:w16="http://schemas.microsoft.com/office/word/2018/wordml" xmlns:w16sdtdh="http://schemas.microsoft.com/office/word/2020/wordml/sdtdatahash" xmlns:w16se="http://schemas.microsoft.com/office/word/2015/wordml/symex" mc:Ignorable="w14 w15 w16se w16cid w16 w16cex w16sdtdh">
+<w:styles xmlns:mc="http://schemas.openxmlformats.org/markup-compatibility/2006" xmlns:r="http://schemas.openxmlformats.org/officeDocument/2006/relationships" xmlns:w="http://schemas.openxmlformats.org/wordprocessingml/2006/main" xmlns:w14="http://schemas.microsoft.com/office/word/2010/wordml" xmlns:w15="http://schemas.microsoft.com/office/word/2012/wordml" xmlns:w16cex="http://schemas.microsoft.com/office/word/2018/wordml/cex" xmlns:w16cid="http://schemas.microsoft.com/office/word/2016/wordml/cid" xmlns:w16="http://schemas.microsoft.com/office/word/2018/wordml" xmlns:w16du="http://schemas.microsoft.com/office/word/2023/wordml/word16du" xmlns:w16sdtdh="http://schemas.microsoft.com/office/word/2020/wordml/sdtdatahash" xmlns:w16sdtfl="http://schemas.microsoft.com/office/word/2024/wordml/sdtformatlock" xmlns:w16se="http://schemas.microsoft.com/office/word/2015/wordml/symex" mc:Ignorable="w14 w15 w16se w16cid w16 w16cex w16sdtdh w16sdtfl w16du">
   <w:docDefaults>
     <w:rPrDefault>
       <w:rPr>

</xml_diff>